<commit_message>
Update documentation: save latest edits to DOCUMENTATION.docx
Co-Authored-By: Claude Opus 5.5 <noreply@anthropic.com>
</commit_message>
<xml_diff>
--- a/docs/DOCUMENTATION.docx
+++ b/docs/DOCUMENTATION.docx
@@ -14231,8 +14231,60 @@
         <w:spacing w:after="60"/>
       </w:pPr>
       <w:r>
-        <w:t>GitHub commit history: [SCREENSHOT]</w:t>
-      </w:r>
+        <w:t xml:space="preserve">GitHub commit history: </w:t>
+      </w:r>
+    </w:p>
+    <w:p>
+      <w:pPr>
+        <w:pStyle w:val="ListParagraph"/>
+        <w:spacing w:after="60"/>
+        <w:ind w:left="720"/>
+      </w:pPr>
+      <w:r>
+        <w:lastRenderedPageBreak/>
+        <w:drawing>
+          <wp:inline distT="0" distB="0" distL="0" distR="0" wp14:anchorId="1FADFDFB" wp14:editId="38B32D82">
+            <wp:extent cx="6120130" cy="3230880"/>
+            <wp:effectExtent l="0" t="0" r="0" b="7620"/>
+            <wp:docPr id="584991352" name="Picture 1"/>
+            <wp:cNvGraphicFramePr>
+              <a:graphicFrameLocks xmlns:a="http://schemas.openxmlformats.org/drawingml/2006/main" noChangeAspect="1"/>
+            </wp:cNvGraphicFramePr>
+            <a:graphic xmlns:a="http://schemas.openxmlformats.org/drawingml/2006/main">
+              <a:graphicData uri="http://schemas.openxmlformats.org/drawingml/2006/picture">
+                <pic:pic xmlns:pic="http://schemas.openxmlformats.org/drawingml/2006/picture">
+                  <pic:nvPicPr>
+                    <pic:cNvPr id="584991352" name=""/>
+                    <pic:cNvPicPr/>
+                  </pic:nvPicPr>
+                  <pic:blipFill>
+                    <a:blip r:embed="rId16"/>
+                    <a:stretch>
+                      <a:fillRect/>
+                    </a:stretch>
+                  </pic:blipFill>
+                  <pic:spPr>
+                    <a:xfrm>
+                      <a:off x="0" y="0"/>
+                      <a:ext cx="6120130" cy="3230880"/>
+                    </a:xfrm>
+                    <a:prstGeom prst="rect">
+                      <a:avLst/>
+                    </a:prstGeom>
+                  </pic:spPr>
+                </pic:pic>
+              </a:graphicData>
+            </a:graphic>
+          </wp:inline>
+        </w:drawing>
+      </w:r>
+    </w:p>
+    <w:p>
+      <w:pPr>
+        <w:pStyle w:val="ListParagraph"/>
+        <w:spacing w:after="60"/>
+        <w:ind w:left="720"/>
+      </w:pPr>
     </w:p>
     <w:p>
       <w:pPr>
@@ -14278,7 +14330,6 @@
         <w:spacing w:after="60"/>
       </w:pPr>
       <w:r>
-        <w:lastRenderedPageBreak/>
         <w:t>AI did well: test-first code meant every function was proven before it was used, and the browser checks used real clicks and typing.</w:t>
       </w:r>
     </w:p>
@@ -14327,7 +14378,7 @@
       </w:pPr>
     </w:p>
     <w:sectPr>
-      <w:footerReference w:type="default" r:id="rId16"/>
+      <w:footerReference w:type="default" r:id="rId17"/>
       <w:pgSz w:w="11906" w:h="16838"/>
       <w:pgMar w:top="1134" w:right="1134" w:bottom="1134" w:left="1134" w:header="708" w:footer="708" w:gutter="0"/>
       <w:cols w:space="720"/>

</xml_diff>

<commit_message>
Update documentation: final edits to DOCUMENTATION.docx and add PDF version
Co-Authored-By: Claude Opus 5.5 <noreply@anthropic.com>
</commit_message>
<xml_diff>
--- a/docs/DOCUMENTATION.docx
+++ b/docs/DOCUMENTATION.docx
@@ -4896,7 +4896,14 @@
                 <w:sz w:val="19"/>
                 <w:szCs w:val="19"/>
               </w:rPr>
-              <w:t xml:space="preserve">Checked Node (v24.15.0) and Python (3.12.10), then wrote PLAN.md: objectives, 3 features as Input → Processing → Output, 12 pure functions for </w:t>
+              <w:t>Checked Node (v24.15.0) and Python (3.12.10), then wrote PLAN.md</w:t>
+            </w:r>
+            <w:r>
+              <w:rPr>
+                <w:sz w:val="19"/>
+                <w:szCs w:val="19"/>
+              </w:rPr>
+              <w:t xml:space="preserve">: objectives, 3 features as Input → Processing → Output, 12 pure functions for </w:t>
             </w:r>
             <w:r>
               <w:rPr>
@@ -11517,7 +11524,10 @@
         <w:spacing w:after="120"/>
       </w:pPr>
       <w:r>
-        <w:t>Full results: TESTING.md. Summary:</w:t>
+        <w:t>Full results: TESTING.md</w:t>
+      </w:r>
+      <w:r>
+        <w:t>. Summary:</w:t>
       </w:r>
     </w:p>
     <w:tbl>
@@ -12983,35 +12993,59 @@
           <w:sz w:val="17"/>
           <w:szCs w:val="17"/>
         </w:rPr>
-        <w:t>ℹ tests 41</w:t>
-      </w:r>
-    </w:p>
-    <w:p>
-      <w:pPr>
-        <w:shd w:val="clear" w:color="auto" w:fill="F2F2F2"/>
-        <w:spacing w:line="260" w:lineRule="auto"/>
-      </w:pPr>
-      <w:r>
-        <w:rPr>
-          <w:rFonts w:ascii="Consolas" w:eastAsia="Consolas" w:hAnsi="Consolas" w:cs="Consolas"/>
-          <w:sz w:val="17"/>
-          <w:szCs w:val="17"/>
-        </w:rPr>
-        <w:t>ℹ pass 41</w:t>
-      </w:r>
-    </w:p>
-    <w:p>
-      <w:pPr>
-        <w:shd w:val="clear" w:color="auto" w:fill="F2F2F2"/>
-        <w:spacing w:line="260" w:lineRule="auto"/>
-      </w:pPr>
-      <w:r>
-        <w:rPr>
-          <w:rFonts w:ascii="Consolas" w:eastAsia="Consolas" w:hAnsi="Consolas" w:cs="Consolas"/>
-          <w:sz w:val="17"/>
-          <w:szCs w:val="17"/>
-        </w:rPr>
-        <w:t>ℹ fail 0</w:t>
+        <w:t>ℹ</w:t>
+      </w:r>
+      <w:r>
+        <w:rPr>
+          <w:rFonts w:ascii="Consolas" w:eastAsia="Consolas" w:hAnsi="Consolas" w:cs="Consolas"/>
+          <w:sz w:val="17"/>
+          <w:szCs w:val="17"/>
+        </w:rPr>
+        <w:t xml:space="preserve"> tests 41</w:t>
+      </w:r>
+    </w:p>
+    <w:p>
+      <w:pPr>
+        <w:shd w:val="clear" w:color="auto" w:fill="F2F2F2"/>
+        <w:spacing w:line="260" w:lineRule="auto"/>
+      </w:pPr>
+      <w:r>
+        <w:rPr>
+          <w:rFonts w:ascii="Consolas" w:eastAsia="Consolas" w:hAnsi="Consolas" w:cs="Consolas"/>
+          <w:sz w:val="17"/>
+          <w:szCs w:val="17"/>
+        </w:rPr>
+        <w:t>ℹ</w:t>
+      </w:r>
+      <w:r>
+        <w:rPr>
+          <w:rFonts w:ascii="Consolas" w:eastAsia="Consolas" w:hAnsi="Consolas" w:cs="Consolas"/>
+          <w:sz w:val="17"/>
+          <w:szCs w:val="17"/>
+        </w:rPr>
+        <w:t xml:space="preserve"> pass 41</w:t>
+      </w:r>
+    </w:p>
+    <w:p>
+      <w:pPr>
+        <w:shd w:val="clear" w:color="auto" w:fill="F2F2F2"/>
+        <w:spacing w:line="260" w:lineRule="auto"/>
+      </w:pPr>
+      <w:r>
+        <w:rPr>
+          <w:rFonts w:ascii="Consolas" w:eastAsia="Consolas" w:hAnsi="Consolas" w:cs="Consolas"/>
+          <w:sz w:val="17"/>
+          <w:szCs w:val="17"/>
+        </w:rPr>
+        <w:t>ℹ</w:t>
+      </w:r>
+      <w:r>
+        <w:rPr>
+          <w:rFonts w:ascii="Consolas" w:eastAsia="Consolas" w:hAnsi="Consolas" w:cs="Consolas"/>
+          <w:sz w:val="17"/>
+          <w:szCs w:val="17"/>
+        </w:rPr>
+        <w:t xml:space="preserve"> fail 0</w:t>
       </w:r>
     </w:p>
     <w:p>
@@ -14296,7 +14330,58 @@
         <w:spacing w:after="60"/>
       </w:pPr>
       <w:r>
-        <w:t>Phone-width view: [SCREENSHOT]</w:t>
+        <w:t xml:space="preserve">Phone-width view: </w:t>
+      </w:r>
+    </w:p>
+    <w:p>
+      <w:pPr>
+        <w:pStyle w:val="ListParagraph"/>
+        <w:spacing w:after="60"/>
+        <w:ind w:left="720"/>
+      </w:pPr>
+    </w:p>
+    <w:p>
+      <w:pPr>
+        <w:pStyle w:val="ListParagraph"/>
+        <w:spacing w:after="60"/>
+        <w:ind w:left="720"/>
+      </w:pPr>
+      <w:r>
+        <w:drawing>
+          <wp:inline distT="0" distB="0" distL="0" distR="0" wp14:anchorId="7D7C51D3" wp14:editId="6EE19117">
+            <wp:extent cx="6120130" cy="4404360"/>
+            <wp:effectExtent l="0" t="0" r="0" b="0"/>
+            <wp:docPr id="661231759" name="Picture 1"/>
+            <wp:cNvGraphicFramePr>
+              <a:graphicFrameLocks xmlns:a="http://schemas.openxmlformats.org/drawingml/2006/main" noChangeAspect="1"/>
+            </wp:cNvGraphicFramePr>
+            <a:graphic xmlns:a="http://schemas.openxmlformats.org/drawingml/2006/main">
+              <a:graphicData uri="http://schemas.openxmlformats.org/drawingml/2006/picture">
+                <pic:pic xmlns:pic="http://schemas.openxmlformats.org/drawingml/2006/picture">
+                  <pic:nvPicPr>
+                    <pic:cNvPr id="661231759" name=""/>
+                    <pic:cNvPicPr/>
+                  </pic:nvPicPr>
+                  <pic:blipFill>
+                    <a:blip r:embed="rId17"/>
+                    <a:stretch>
+                      <a:fillRect/>
+                    </a:stretch>
+                  </pic:blipFill>
+                  <pic:spPr>
+                    <a:xfrm>
+                      <a:off x="0" y="0"/>
+                      <a:ext cx="6120130" cy="4404360"/>
+                    </a:xfrm>
+                    <a:prstGeom prst="rect">
+                      <a:avLst/>
+                    </a:prstGeom>
+                  </pic:spPr>
+                </pic:pic>
+              </a:graphicData>
+            </a:graphic>
+          </wp:inline>
+        </w:drawing>
       </w:r>
     </w:p>
     <w:p>
@@ -14330,6 +14415,7 @@
         <w:spacing w:after="60"/>
       </w:pPr>
       <w:r>
+        <w:lastRenderedPageBreak/>
         <w:t>AI did well: test-first code meant every function was proven before it was used, and the browser checks used real clicks and typing.</w:t>
       </w:r>
     </w:p>
@@ -14378,7 +14464,7 @@
       </w:pPr>
     </w:p>
     <w:sectPr>
-      <w:footerReference w:type="default" r:id="rId17"/>
+      <w:footerReference w:type="default" r:id="rId18"/>
       <w:pgSz w:w="11906" w:h="16838"/>
       <w:pgMar w:top="1134" w:right="1134" w:bottom="1134" w:left="1134" w:header="708" w:footer="708" w:gutter="0"/>
       <w:cols w:space="720"/>

</xml_diff>